<commit_message>
i add the week 6
</commit_message>
<xml_diff>
--- a/CSE341/Week4/FinalProjectProposal.docx
+++ b/CSE341/Week4/FinalProjectProposal.docx
@@ -49,13 +49,12 @@
     <w:p>
       <w:pPr>
         <w:pStyle w:val="Normal"/>
-        <w:rPr/>
-      </w:pPr>
-      <w:r>
-        <w:rPr>
-          <w:highlight w:val="yellow"/>
-        </w:rPr>
-        <w:t>All highlighted text in this document is for your group to edit. …starting with deleting this one. ☺</w:t>
+        <w:rPr>
+          <w:highlight w:val="yellow"/>
+        </w:rPr>
+      </w:pPr>
+      <w:r>
+        <w:rPr/>
       </w:r>
     </w:p>
     <w:p>
@@ -99,7 +98,19 @@
         <w:rPr>
           <w:highlight w:val="yellow"/>
         </w:rPr>
-        <w:t xml:space="preserve">Sergio Bergerant </w:t>
+        <w:t xml:space="preserve">Sergio </w:t>
+      </w:r>
+      <w:r>
+        <w:rPr>
+          <w:highlight w:val="yellow"/>
+        </w:rPr>
+        <w:t>B</w:t>
+      </w:r>
+      <w:r>
+        <w:rPr>
+          <w:highlight w:val="yellow"/>
+        </w:rPr>
+        <w:t xml:space="preserve">ergerat </w:t>
       </w:r>
     </w:p>
     <w:p>
@@ -114,7 +125,19 @@
         <w:rPr>
           <w:highlight w:val="yellow"/>
         </w:rPr>
-        <w:t xml:space="preserve">Saul Abraham Arana </w:t>
+        <w:t xml:space="preserve">Saul </w:t>
+      </w:r>
+      <w:r>
+        <w:rPr>
+          <w:highlight w:val="yellow"/>
+        </w:rPr>
+        <w:t xml:space="preserve">Abraham Arana </w:t>
+      </w:r>
+      <w:r>
+        <w:rPr>
+          <w:highlight w:val="yellow"/>
+        </w:rPr>
+        <w:t>Calderón</w:t>
       </w:r>
     </w:p>
     <w:p>
@@ -146,6 +169,7 @@
     <w:p>
       <w:pPr>
         <w:pStyle w:val="Normal"/>
+        <w:spacing w:before="0" w:after="160"/>
         <w:jc w:val="center"/>
         <w:rPr/>
       </w:pPr>
@@ -159,7 +183,6 @@
         <w:pStyle w:val="Normal"/>
         <w:keepNext w:val="true"/>
         <w:keepLines/>
-        <w:pBdr/>
         <w:spacing w:before="240" w:after="0"/>
         <w:rPr>
           <w:color w:val="2F5496"/>
@@ -896,6 +919,7 @@
     <w:p>
       <w:pPr>
         <w:pStyle w:val="Heading1"/>
+        <w:spacing w:before="0" w:after="0"/>
         <w:rPr/>
       </w:pPr>
       <w:bookmarkStart w:id="2" w:name="__RefHeading___Toc807_864148131"/>
@@ -2301,13 +2325,7 @@
         <w:rPr>
           <w:highlight w:val="yellow"/>
         </w:rPr>
-        <w:t xml:space="preserve"> </w:t>
-      </w:r>
-      <w:r>
-        <w:rPr>
-          <w:highlight w:val="yellow"/>
-        </w:rPr>
-        <w:t>Daniel</w:t>
+        <w:t xml:space="preserve"> Daniel</w:t>
       </w:r>
     </w:p>
     <w:p>
@@ -2480,13 +2498,7 @@
         <w:rPr>
           <w:highlight w:val="yellow"/>
         </w:rPr>
-        <w:t xml:space="preserve">: </w:t>
-      </w:r>
-      <w:r>
-        <w:rPr>
-          <w:highlight w:val="yellow"/>
-        </w:rPr>
-        <w:t>Sergio</w:t>
+        <w:t>: Sergio</w:t>
       </w:r>
     </w:p>
     <w:p>
@@ -2668,7 +2680,6 @@
   <w:p>
     <w:pPr>
       <w:pStyle w:val="Normal"/>
-      <w:pBdr/>
       <w:tabs>
         <w:tab w:val="clear" w:pos="720"/>
         <w:tab w:val="center" w:pos="4680" w:leader="none"/>
@@ -2727,7 +2738,6 @@
   <w:p>
     <w:pPr>
       <w:pStyle w:val="Normal"/>
-      <w:pBdr/>
       <w:tabs>
         <w:tab w:val="clear" w:pos="720"/>
         <w:tab w:val="center" w:pos="4680" w:leader="none"/>
@@ -2752,7 +2762,6 @@
   <w:p>
     <w:pPr>
       <w:pStyle w:val="Normal"/>
-      <w:pBdr/>
       <w:tabs>
         <w:tab w:val="clear" w:pos="720"/>
         <w:tab w:val="center" w:pos="4680" w:leader="none"/>
@@ -2811,7 +2820,6 @@
   <w:p>
     <w:pPr>
       <w:pStyle w:val="Normal"/>
-      <w:pBdr/>
       <w:tabs>
         <w:tab w:val="clear" w:pos="720"/>
         <w:tab w:val="center" w:pos="4680" w:leader="none"/>
@@ -4216,6 +4224,7 @@
     <w:qFormat/>
     <w:pPr>
       <w:widowControl/>
+      <w:suppressAutoHyphens w:val="true"/>
       <w:bidi w:val="0"/>
       <w:spacing w:lineRule="auto" w:line="259" w:before="0" w:after="160"/>
       <w:jc w:val="start"/>
@@ -4364,8 +4373,8 @@
     <w:qFormat/>
     <w:rPr/>
   </w:style>
-  <w:style w:type="character" w:styleId="Bullets">
-    <w:name w:val="Bullets"/>
+  <w:style w:type="character" w:styleId="Bulletsuser">
+    <w:name w:val="Bullets (user)"/>
     <w:qFormat/>
     <w:rPr>
       <w:rFonts w:ascii="OpenSymbol" w:hAnsi="OpenSymbol" w:eastAsia="OpenSymbol" w:cs="OpenSymbol"/>

</xml_diff>